<commit_message>
content: reconcile resume to Accelera CTO (docx+pdf regenerated, 20 yrs); add Accelera 97->140 org leadership to site
</commit_message>
<xml_diff>
--- a/public/assets/resume/Dayel_Ostraco_Resume_FullStackAI.docx
+++ b/public/assets/resume/Dayel_Ostraco_Resume_FullStackAI.docx
@@ -296,7 +296,7 @@
           <w:sz w:val="21"/>
           <w:szCs w:val="21"/>
         </w:rPr>
-        <w:t xml:space="preserve"> with 17 years of experience designing and delivering </w:t>
+        <w:t xml:space="preserve"> with 20 years of experience designing and delivering </w:t>
       </w:r>
       <w:r>
         <w:rPr>
@@ -1049,7 +1049,7 @@
           <w:sz w:val="22"/>
           <w:szCs w:val="22"/>
         </w:rPr>
-        <w:t>Cloud Solutions Architect III, Modus21, Charleston, SC</w:t>
+        <w:t>Chief Technology Officer, Accelera Solutions, Charleston, SC</w:t>
       </w:r>
     </w:p>
     <w:p>

</xml_diff>

<commit_message>
content: reconcile resume to Accelera CTO (docx+pdf regenerated, 20 yrs); add Accelera 97->140 org leadership to site (#23)
Co-authored-by: dayelostraco <dayel.ostraco@gmail.com>
</commit_message>
<xml_diff>
--- a/public/assets/resume/Dayel_Ostraco_Resume_FullStackAI.docx
+++ b/public/assets/resume/Dayel_Ostraco_Resume_FullStackAI.docx
@@ -296,7 +296,7 @@
           <w:sz w:val="21"/>
           <w:szCs w:val="21"/>
         </w:rPr>
-        <w:t xml:space="preserve"> with 17 years of experience designing and delivering </w:t>
+        <w:t xml:space="preserve"> with 20 years of experience designing and delivering </w:t>
       </w:r>
       <w:r>
         <w:rPr>
@@ -1049,7 +1049,7 @@
           <w:sz w:val="22"/>
           <w:szCs w:val="22"/>
         </w:rPr>
-        <w:t>Cloud Solutions Architect III, Modus21, Charleston, SC</w:t>
+        <w:t>Chief Technology Officer, Accelera Solutions, Charleston, SC</w:t>
       </w:r>
     </w:p>
     <w:p>

</xml_diff>